<commit_message>
docs(m6): contexto del dominio para quien no viene de citogenetica
El documento arrancaba hablando de "cromosomas naranjas" y de estados del
flujo sin explicar que es un cariotipo. Se antepone una seccion de contexto
para que la entrega se pueda evaluar sin conocer el area:

  - que es un cariotipo y para que sirve (con ISCN en dos ejemplos)
  - como se produce en el laboratorio, y cual es el paso caro que se automatiza
  - por que hay DOS IA distintas y por que no compiten: la discriminativa
    clasifica imagenes y nunca ve texto, la generativa enruta preguntas y
    nunca ve la base de datos
  - el semaforo de confianza y la regla RN-02 que lo hace obligatorio
  - el flujo de estados de un caso, mapeado a las cuatro herramientas

Queda explicito que la seccion no es requisito de la consigna.

Ademas: ~$* al .gitignore (temporales que Word crea al abrir un .docx).
</commit_message>
<xml_diff>
--- a/docs/ENTREGA_TOOL_CALLING.docx
+++ b/docs/ENTREGA_TOOL_CALLING.docx
@@ -328,6 +328,898 @@
       </w:tr>
     </w:tbl>
     <w:p/>
+    <w:p/>
+    <w:p>
+      <w:pPr>
+        <w:pStyle w:val="Heading2"/>
+      </w:pPr>
+      <w:r>
+        <w:t>1-bis. Contexto del dominio (para quien no viene del área)</w:t>
+      </w:r>
+    </w:p>
+    <w:p>
+      <w:r>
+        <w:t>Esta sección existe para que la entrega se pueda evaluar sin conocer</w:t>
+      </w:r>
+    </w:p>
+    <w:p>
+      <w:r>
+        <w:t xml:space="preserve">citogenética. </w:t>
+      </w:r>
+      <w:r>
+        <w:rPr>
+          <w:b/>
+        </w:rPr>
+        <w:t>Nada de lo que sigue es requisito de la consigna</w:t>
+      </w:r>
+      <w:r>
+        <w:t>: es el mínimo</w:t>
+      </w:r>
+    </w:p>
+    <w:p>
+      <w:r>
+        <w:t>para que las cuatro herramientas tengan sentido.</w:t>
+      </w:r>
+    </w:p>
+    <w:p>
+      <w:pPr>
+        <w:pStyle w:val="Heading3"/>
+      </w:pPr>
+      <w:r>
+        <w:t>Qué es un cariotipo</w:t>
+      </w:r>
+    </w:p>
+    <w:p>
+      <w:r>
+        <w:t xml:space="preserve">Un </w:t>
+      </w:r>
+      <w:r>
+        <w:rPr>
+          <w:b/>
+        </w:rPr>
+        <w:t>cariotipo</w:t>
+      </w:r>
+      <w:r>
+        <w:t xml:space="preserve"> es el retrato ordenado de los 46 cromosomas de una persona.</w:t>
+      </w:r>
+    </w:p>
+    <w:p>
+      <w:r>
+        <w:t>Sirve para detectar alteraciones genéticas: un cromosoma de más, uno de menos, un</w:t>
+      </w:r>
+    </w:p>
+    <w:p>
+      <w:r>
+        <w:t>trozo cambiado de sitio. El síndrome de Down, por ejemplo, es una tercera copia</w:t>
+      </w:r>
+    </w:p>
+    <w:p>
+      <w:r>
+        <w:t>del cromosoma 21.</w:t>
+      </w:r>
+    </w:p>
+    <w:p>
+      <w:r>
+        <w:t xml:space="preserve">El resultado se escribe en una nomenclatura internacional, </w:t>
+      </w:r>
+      <w:r>
+        <w:rPr>
+          <w:b/>
+        </w:rPr>
+        <w:t>ISCN</w:t>
+      </w:r>
+      <w:r>
+        <w:t>:</w:t>
+      </w:r>
+    </w:p>
+    <w:p>
+      <w:pPr>
+        <w:spacing w:after="200"/>
+        <w:ind w:left="280"/>
+      </w:pPr>
+      <w:r>
+        <w:rPr>
+          <w:rFonts w:ascii="Consolas" w:hAnsi="Consolas"/>
+          <w:color w:val="1F2A37"/>
+          <w:sz w:val="17"/>
+        </w:rPr>
+        <w:t>46,XY        varón sin alteraciones numéricas</w:t>
+        <w:br/>
+        <w:t>47,XX,+21    mujer con una copia extra del cromosoma 21 (síndrome de Down)</w:t>
+      </w:r>
+    </w:p>
+    <w:p>
+      <w:pPr>
+        <w:pStyle w:val="Heading3"/>
+      </w:pPr>
+      <w:r>
+        <w:t>Cómo se produce en el laboratorio</w:t>
+      </w:r>
+    </w:p>
+    <w:p>
+      <w:pPr>
+        <w:pStyle w:val="ListNumber"/>
+      </w:pPr>
+      <w:r>
+        <w:t>Se cultiva una muestra de sangre y se detiene la división celular en</w:t>
+      </w:r>
+    </w:p>
+    <w:p>
+      <w:r>
+        <w:t xml:space="preserve">   </w:t>
+      </w:r>
+      <w:r>
+        <w:rPr>
+          <w:b/>
+        </w:rPr>
+        <w:t>metafase</w:t>
+      </w:r>
+      <w:r>
+        <w:t>, el único momento en que los cromosomas se ven al microscopio</w:t>
+      </w:r>
+    </w:p>
+    <w:p>
+      <w:r>
+        <w:t xml:space="preserve">   como cuerpos separados.</w:t>
+      </w:r>
+    </w:p>
+    <w:p>
+      <w:pPr>
+        <w:pStyle w:val="ListNumber"/>
+      </w:pPr>
+      <w:r>
+        <w:t>Se fotografía una célula. Esa imagen —la metafase— muestra los 46 cromosomas</w:t>
+      </w:r>
+    </w:p>
+    <w:p>
+      <w:r>
+        <w:t xml:space="preserve">   </w:t>
+      </w:r>
+      <w:r>
+        <w:rPr>
+          <w:b/>
+        </w:rPr>
+        <w:t>desordenados, girados y a menudo tocándose entre sí</w:t>
+      </w:r>
+      <w:r>
+        <w:t>.</w:t>
+      </w:r>
+    </w:p>
+    <w:p>
+      <w:pPr>
+        <w:pStyle w:val="ListNumber"/>
+      </w:pPr>
+      <w:r>
+        <w:t>Alguien recorta cada cromosoma y los ordena por parejas, del 1 al 22 más los</w:t>
+      </w:r>
+    </w:p>
+    <w:p>
+      <w:r>
+        <w:t xml:space="preserve">   sexuales. A ese resultado ordenado se le llama </w:t>
+      </w:r>
+      <w:r>
+        <w:rPr>
+          <w:b/>
+        </w:rPr>
+        <w:t>cariograma</w:t>
+      </w:r>
+      <w:r>
+        <w:t>.</w:t>
+      </w:r>
+    </w:p>
+    <w:p>
+      <w:pPr>
+        <w:pStyle w:val="ListNumber"/>
+      </w:pPr>
+      <w:r>
+        <w:t>Se redacta el informe con la nomenclatura ISCN.</w:t>
+      </w:r>
+    </w:p>
+    <w:p>
+      <w:r>
+        <w:t>Hecho a mano, el paso 3 es el caro: entre 20 y 30 minutos de trabajo experto por</w:t>
+      </w:r>
+    </w:p>
+    <w:p>
+      <w:r>
+        <w:t xml:space="preserve">caso. </w:t>
+      </w:r>
+      <w:r>
+        <w:rPr>
+          <w:b/>
+        </w:rPr>
+        <w:t>Eso es lo que este sistema automatiza.</w:t>
+      </w:r>
+    </w:p>
+    <w:p>
+      <w:pPr>
+        <w:pStyle w:val="Heading3"/>
+      </w:pPr>
+      <w:r>
+        <w:t>Dónde entra la IA, y por qué hay dos IA distintas</w:t>
+      </w:r>
+    </w:p>
+    <w:tbl>
+      <w:tblPr>
+        <w:tblStyle w:val="LightGrid-Accent1"/>
+        <w:tblW w:type="auto" w:w="0"/>
+        <w:tblLook w:firstColumn="1" w:firstRow="1" w:lastColumn="0" w:lastRow="0" w:noHBand="0" w:noVBand="1" w:val="04A0"/>
+      </w:tblPr>
+      <w:tblGrid>
+        <w:gridCol w:w="2880"/>
+        <w:gridCol w:w="2880"/>
+        <w:gridCol w:w="2880"/>
+      </w:tblGrid>
+      <w:tr>
+        <w:tc>
+          <w:tcPr>
+            <w:tcW w:type="dxa" w:w="2880"/>
+          </w:tcPr>
+          <w:p>
+            <w:r>
+              <w:rPr>
+                <w:b/>
+              </w:rPr>
+            </w:r>
+          </w:p>
+        </w:tc>
+        <w:tc>
+          <w:tcPr>
+            <w:tcW w:type="dxa" w:w="2880"/>
+          </w:tcPr>
+          <w:p>
+            <w:r>
+              <w:rPr>
+                <w:b/>
+              </w:rPr>
+            </w:r>
+            <w:r>
+              <w:rPr>
+                <w:b/>
+              </w:rPr>
+              <w:t>Qué hace</w:t>
+            </w:r>
+          </w:p>
+        </w:tc>
+        <w:tc>
+          <w:tcPr>
+            <w:tcW w:type="dxa" w:w="2880"/>
+          </w:tcPr>
+          <w:p>
+            <w:r>
+              <w:rPr>
+                <w:b/>
+              </w:rPr>
+            </w:r>
+            <w:r>
+              <w:rPr>
+                <w:b/>
+              </w:rPr>
+              <w:t>Tipo</w:t>
+            </w:r>
+          </w:p>
+        </w:tc>
+      </w:tr>
+      <w:tr>
+        <w:tc>
+          <w:tcPr>
+            <w:tcW w:type="dxa" w:w="2880"/>
+          </w:tcPr>
+          <w:p>
+            <w:r/>
+            <w:r>
+              <w:t>EfficientNet-B3</w:t>
+            </w:r>
+          </w:p>
+        </w:tc>
+        <w:tc>
+          <w:tcPr>
+            <w:tcW w:type="dxa" w:w="2880"/>
+          </w:tcPr>
+          <w:p>
+            <w:r/>
+            <w:r>
+              <w:t xml:space="preserve">Mira el recorte de un cromosoma y dice </w:t>
+            </w:r>
+            <w:r>
+              <w:rPr>
+                <w:b/>
+              </w:rPr>
+              <w:t>cuál de los 24 es</w:t>
+            </w:r>
+          </w:p>
+        </w:tc>
+        <w:tc>
+          <w:tcPr>
+            <w:tcW w:type="dxa" w:w="2880"/>
+          </w:tcPr>
+          <w:p>
+            <w:r/>
+            <w:r>
+              <w:t xml:space="preserve">IA </w:t>
+            </w:r>
+            <w:r>
+              <w:rPr>
+                <w:b/>
+              </w:rPr>
+              <w:t>discriminativa</w:t>
+            </w:r>
+            <w:r>
+              <w:t xml:space="preserve"> (imagen → etiqueta)</w:t>
+            </w:r>
+          </w:p>
+        </w:tc>
+      </w:tr>
+      <w:tr>
+        <w:tc>
+          <w:tcPr>
+            <w:tcW w:type="dxa" w:w="2880"/>
+          </w:tcPr>
+          <w:p>
+            <w:r/>
+            <w:r>
+              <w:rPr>
+                <w:rFonts w:ascii="Consolas" w:hAnsi="Consolas"/>
+                <w:sz w:val="19"/>
+              </w:rPr>
+              <w:t>llama3.2:3b</w:t>
+            </w:r>
+            <w:r>
+              <w:t xml:space="preserve"> (este módulo)</w:t>
+            </w:r>
+          </w:p>
+        </w:tc>
+        <w:tc>
+          <w:tcPr>
+            <w:tcW w:type="dxa" w:w="2880"/>
+          </w:tcPr>
+          <w:p>
+            <w:r/>
+            <w:r>
+              <w:t xml:space="preserve">Elige </w:t>
+            </w:r>
+            <w:r>
+              <w:rPr>
+                <w:b/>
+              </w:rPr>
+              <w:t>qué consulta</w:t>
+            </w:r>
+            <w:r>
+              <w:t xml:space="preserve"> responde una pregunta escrita en castellano</w:t>
+            </w:r>
+          </w:p>
+        </w:tc>
+        <w:tc>
+          <w:tcPr>
+            <w:tcW w:type="dxa" w:w="2880"/>
+          </w:tcPr>
+          <w:p>
+            <w:r/>
+            <w:r>
+              <w:t xml:space="preserve">IA </w:t>
+            </w:r>
+            <w:r>
+              <w:rPr>
+                <w:b/>
+              </w:rPr>
+              <w:t>generativa</w:t>
+            </w:r>
+            <w:r>
+              <w:t xml:space="preserve"> (texto → texto)</w:t>
+            </w:r>
+          </w:p>
+        </w:tc>
+      </w:tr>
+    </w:tbl>
+    <w:p/>
+    <w:p>
+      <w:r>
+        <w:t xml:space="preserve">No compiten: la primera clasifica imágenes y </w:t>
+      </w:r>
+      <w:r>
+        <w:rPr>
+          <w:b/>
+        </w:rPr>
+        <w:t>nunca ve texto</w:t>
+      </w:r>
+      <w:r>
+        <w:t>; la segunda</w:t>
+      </w:r>
+    </w:p>
+    <w:p>
+      <w:r>
+        <w:t xml:space="preserve">enruta preguntas y </w:t>
+      </w:r>
+      <w:r>
+        <w:rPr>
+          <w:b/>
+        </w:rPr>
+        <w:t>nunca ve la base de datos</w:t>
+      </w:r>
+      <w:r>
+        <w:t>.</w:t>
+      </w:r>
+    </w:p>
+    <w:p>
+      <w:pPr>
+        <w:pStyle w:val="Heading3"/>
+      </w:pPr>
+      <w:r>
+        <w:t>El semáforo: por qué existen los «cromosomas naranjas»</w:t>
+      </w:r>
+    </w:p>
+    <w:p>
+      <w:r>
+        <w:t xml:space="preserve">El clasificador no solo dice qué cromosoma es, también </w:t>
+      </w:r>
+      <w:r>
+        <w:rPr>
+          <w:b/>
+        </w:rPr>
+        <w:t>cuánta confianza tiene</w:t>
+      </w:r>
+      <w:r>
+        <w:t>.</w:t>
+      </w:r>
+    </w:p>
+    <w:p>
+      <w:r>
+        <w:t>El sistema lo traduce a un color:</w:t>
+      </w:r>
+    </w:p>
+    <w:tbl>
+      <w:tblPr>
+        <w:tblStyle w:val="LightGrid-Accent1"/>
+        <w:tblW w:type="auto" w:w="0"/>
+        <w:tblLook w:firstColumn="1" w:firstRow="1" w:lastColumn="0" w:lastRow="0" w:noHBand="0" w:noVBand="1" w:val="04A0"/>
+      </w:tblPr>
+      <w:tblGrid>
+        <w:gridCol w:w="2880"/>
+        <w:gridCol w:w="2880"/>
+        <w:gridCol w:w="2880"/>
+      </w:tblGrid>
+      <w:tr>
+        <w:tc>
+          <w:tcPr>
+            <w:tcW w:type="dxa" w:w="2880"/>
+          </w:tcPr>
+          <w:p>
+            <w:r>
+              <w:rPr>
+                <w:b/>
+              </w:rPr>
+            </w:r>
+            <w:r>
+              <w:rPr>
+                <w:b/>
+              </w:rPr>
+              <w:t>Color</w:t>
+            </w:r>
+          </w:p>
+        </w:tc>
+        <w:tc>
+          <w:tcPr>
+            <w:tcW w:type="dxa" w:w="2880"/>
+          </w:tcPr>
+          <w:p>
+            <w:r>
+              <w:rPr>
+                <w:b/>
+              </w:rPr>
+            </w:r>
+            <w:r>
+              <w:rPr>
+                <w:b/>
+              </w:rPr>
+              <w:t>Condición</w:t>
+            </w:r>
+          </w:p>
+        </w:tc>
+        <w:tc>
+          <w:tcPr>
+            <w:tcW w:type="dxa" w:w="2880"/>
+          </w:tcPr>
+          <w:p>
+            <w:r>
+              <w:rPr>
+                <w:b/>
+              </w:rPr>
+            </w:r>
+            <w:r>
+              <w:rPr>
+                <w:b/>
+              </w:rPr>
+              <w:t>Significado</w:t>
+            </w:r>
+          </w:p>
+        </w:tc>
+      </w:tr>
+      <w:tr>
+        <w:tc>
+          <w:tcPr>
+            <w:tcW w:type="dxa" w:w="2880"/>
+          </w:tcPr>
+          <w:p>
+            <w:r/>
+            <w:r>
+              <w:t>Verde</w:t>
+            </w:r>
+          </w:p>
+        </w:tc>
+        <w:tc>
+          <w:tcPr>
+            <w:tcW w:type="dxa" w:w="2880"/>
+          </w:tcPr>
+          <w:p>
+            <w:r/>
+            <w:r>
+              <w:t>confianza ≥ 0,85</w:t>
+            </w:r>
+          </w:p>
+        </w:tc>
+        <w:tc>
+          <w:tcPr>
+            <w:tcW w:type="dxa" w:w="2880"/>
+          </w:tcPr>
+          <w:p>
+            <w:r/>
+            <w:r>
+              <w:t>La IA está segura</w:t>
+            </w:r>
+          </w:p>
+        </w:tc>
+      </w:tr>
+      <w:tr>
+        <w:tc>
+          <w:tcPr>
+            <w:tcW w:type="dxa" w:w="2880"/>
+          </w:tcPr>
+          <w:p>
+            <w:r/>
+            <w:r>
+              <w:rPr>
+                <w:b/>
+              </w:rPr>
+              <w:t>Naranja</w:t>
+            </w:r>
+          </w:p>
+        </w:tc>
+        <w:tc>
+          <w:tcPr>
+            <w:tcW w:type="dxa" w:w="2880"/>
+          </w:tcPr>
+          <w:p>
+            <w:r/>
+            <w:r>
+              <w:t>confianza &lt; 0,85</w:t>
+            </w:r>
+          </w:p>
+        </w:tc>
+        <w:tc>
+          <w:tcPr>
+            <w:tcW w:type="dxa" w:w="2880"/>
+          </w:tcPr>
+          <w:p>
+            <w:r/>
+            <w:r>
+              <w:rPr>
+                <w:b/>
+              </w:rPr>
+              <w:t>La IA duda: lo revisa una persona</w:t>
+            </w:r>
+          </w:p>
+        </w:tc>
+      </w:tr>
+      <w:tr>
+        <w:tc>
+          <w:tcPr>
+            <w:tcW w:type="dxa" w:w="2880"/>
+          </w:tcPr>
+          <w:p>
+            <w:r/>
+            <w:r>
+              <w:t>Rojo</w:t>
+            </w:r>
+          </w:p>
+        </w:tc>
+        <w:tc>
+          <w:tcPr>
+            <w:tcW w:type="dxa" w:w="2880"/>
+          </w:tcPr>
+          <w:p>
+            <w:r/>
+            <w:r>
+              <w:t>sin confianza</w:t>
+            </w:r>
+          </w:p>
+        </w:tc>
+        <w:tc>
+          <w:tcPr>
+            <w:tcW w:type="dxa" w:w="2880"/>
+          </w:tcPr>
+          <w:p>
+            <w:r/>
+            <w:r>
+              <w:t>La clasificación falló</w:t>
+            </w:r>
+          </w:p>
+        </w:tc>
+      </w:tr>
+    </w:tbl>
+    <w:p/>
+    <w:p>
+      <w:r>
+        <w:t>Una regla clínica del proyecto (</w:t>
+      </w:r>
+      <w:r>
+        <w:rPr>
+          <w:b/>
+        </w:rPr>
+        <w:t>RN-02</w:t>
+      </w:r>
+      <w:r>
+        <w:t>) obliga a que ningún caso con naranjas</w:t>
+      </w:r>
+    </w:p>
+    <w:p>
+      <w:r>
+        <w:t>sin resolver pueda emitir informe. Es el mecanismo *human-in-the-loop*: un</w:t>
+      </w:r>
+    </w:p>
+    <w:p>
+      <w:r>
+        <w:t>cariotipo es un diagnóstico, y un modelo que acierta el 70% no puede firmarlo</w:t>
+      </w:r>
+    </w:p>
+    <w:p>
+      <w:r>
+        <w:t>solo. En vez de exigir revisión manual de los 46 cromosomas —lo que anularía el</w:t>
+      </w:r>
+    </w:p>
+    <w:p>
+      <w:r>
+        <w:t xml:space="preserve">valor de automatizar— </w:t>
+      </w:r>
+      <w:r>
+        <w:rPr>
+          <w:b/>
+        </w:rPr>
+        <w:t>se concentra la atención humana donde la máquina flaquea</w:t>
+      </w:r>
+      <w:r>
+        <w:t>.</w:t>
+      </w:r>
+    </w:p>
+    <w:p>
+      <w:pPr>
+        <w:pStyle w:val="Heading3"/>
+      </w:pPr>
+      <w:r>
+        <w:t>El flujo de un caso, que es lo que consultan las herramientas</w:t>
+      </w:r>
+    </w:p>
+    <w:p>
+      <w:pPr>
+        <w:spacing w:after="200"/>
+        <w:ind w:left="280"/>
+      </w:pPr>
+      <w:r>
+        <w:rPr>
+          <w:rFonts w:ascii="Consolas" w:hAnsi="Consolas"/>
+          <w:color w:val="1F2A37"/>
+          <w:sz w:val="17"/>
+        </w:rPr>
+        <w:t xml:space="preserve">   registrada ──&gt; EN PROCESO ──&gt; VALIDADA ──&gt; FIRMADA ──&gt; REPORTADA</w:t>
+        <w:br/>
+        <w:t xml:space="preserve">                  (la IA          (el analista  (el supervisor   (informe</w:t>
+        <w:br/>
+        <w:t xml:space="preserve">                   analiza)        resolvió      firmó con        emitido</w:t>
+        <w:br/>
+        <w:t xml:space="preserve">                                   los naranjas)  segundo factor)  con ISCN)</w:t>
+      </w:r>
+    </w:p>
+    <w:p>
+      <w:r>
+        <w:t xml:space="preserve">Las cuatro herramientas publicadas responden </w:t>
+      </w:r>
+      <w:r>
+        <w:rPr>
+          <w:b/>
+        </w:rPr>
+        <w:t>«¿qué hay en cada etapa?»</w:t>
+      </w:r>
+      <w:r>
+        <w:t>:</w:t>
+      </w:r>
+    </w:p>
+    <w:tbl>
+      <w:tblPr>
+        <w:tblStyle w:val="LightGrid-Accent1"/>
+        <w:tblW w:type="auto" w:w="0"/>
+        <w:tblLook w:firstColumn="1" w:firstRow="1" w:lastColumn="0" w:lastRow="0" w:noHBand="0" w:noVBand="1" w:val="04A0"/>
+      </w:tblPr>
+      <w:tblGrid>
+        <w:gridCol w:w="4320"/>
+        <w:gridCol w:w="4320"/>
+      </w:tblGrid>
+      <w:tr>
+        <w:tc>
+          <w:tcPr>
+            <w:tcW w:type="dxa" w:w="4320"/>
+          </w:tcPr>
+          <w:p>
+            <w:r>
+              <w:rPr>
+                <w:b/>
+              </w:rPr>
+            </w:r>
+            <w:r>
+              <w:rPr>
+                <w:b/>
+              </w:rPr>
+              <w:t>Herramienta</w:t>
+            </w:r>
+          </w:p>
+        </w:tc>
+        <w:tc>
+          <w:tcPr>
+            <w:tcW w:type="dxa" w:w="4320"/>
+          </w:tcPr>
+          <w:p>
+            <w:r>
+              <w:rPr>
+                <w:b/>
+              </w:rPr>
+            </w:r>
+            <w:r>
+              <w:rPr>
+                <w:b/>
+              </w:rPr>
+              <w:t>Pregunta que responde</w:t>
+            </w:r>
+          </w:p>
+        </w:tc>
+      </w:tr>
+      <w:tr>
+        <w:tc>
+          <w:tcPr>
+            <w:tcW w:type="dxa" w:w="4320"/>
+          </w:tcPr>
+          <w:p>
+            <w:r/>
+            <w:r>
+              <w:rPr>
+                <w:rFonts w:ascii="Consolas" w:hAnsi="Consolas"/>
+                <w:sz w:val="19"/>
+              </w:rPr>
+              <w:t>CASOS_EN_PROCESO</w:t>
+            </w:r>
+          </w:p>
+        </w:tc>
+        <w:tc>
+          <w:tcPr>
+            <w:tcW w:type="dxa" w:w="4320"/>
+          </w:tcPr>
+          <w:p>
+            <w:r/>
+            <w:r>
+              <w:t>¿Qué está analizando el sistema ahora?</w:t>
+            </w:r>
+          </w:p>
+        </w:tc>
+      </w:tr>
+      <w:tr>
+        <w:tc>
+          <w:tcPr>
+            <w:tcW w:type="dxa" w:w="4320"/>
+          </w:tcPr>
+          <w:p>
+            <w:r/>
+            <w:r>
+              <w:rPr>
+                <w:rFonts w:ascii="Consolas" w:hAnsi="Consolas"/>
+                <w:sz w:val="19"/>
+              </w:rPr>
+              <w:t>CROMOSOMAS_PARA_REVISION</w:t>
+            </w:r>
+          </w:p>
+        </w:tc>
+        <w:tc>
+          <w:tcPr>
+            <w:tcW w:type="dxa" w:w="4320"/>
+          </w:tcPr>
+          <w:p>
+            <w:r/>
+            <w:r>
+              <w:t>¿Qué le toca revisar al analista? (los naranjas)</w:t>
+            </w:r>
+          </w:p>
+        </w:tc>
+      </w:tr>
+      <w:tr>
+        <w:tc>
+          <w:tcPr>
+            <w:tcW w:type="dxa" w:w="4320"/>
+          </w:tcPr>
+          <w:p>
+            <w:r/>
+            <w:r>
+              <w:rPr>
+                <w:rFonts w:ascii="Consolas" w:hAnsi="Consolas"/>
+                <w:sz w:val="19"/>
+              </w:rPr>
+              <w:t>CASOS_PENDIENTES_FIRMA</w:t>
+            </w:r>
+          </w:p>
+        </w:tc>
+        <w:tc>
+          <w:tcPr>
+            <w:tcW w:type="dxa" w:w="4320"/>
+          </w:tcPr>
+          <w:p>
+            <w:r/>
+            <w:r>
+              <w:t>¿Qué espera la firma del supervisor?</w:t>
+            </w:r>
+          </w:p>
+        </w:tc>
+      </w:tr>
+      <w:tr>
+        <w:tc>
+          <w:tcPr>
+            <w:tcW w:type="dxa" w:w="4320"/>
+          </w:tcPr>
+          <w:p>
+            <w:r/>
+            <w:r>
+              <w:rPr>
+                <w:rFonts w:ascii="Consolas" w:hAnsi="Consolas"/>
+                <w:sz w:val="19"/>
+              </w:rPr>
+              <w:t>CASOS_REPORTADOS</w:t>
+            </w:r>
+          </w:p>
+        </w:tc>
+        <w:tc>
+          <w:tcPr>
+            <w:tcW w:type="dxa" w:w="4320"/>
+          </w:tcPr>
+          <w:p>
+            <w:r/>
+            <w:r>
+              <w:t>¿Qué ya se entregó al médico?</w:t>
+            </w:r>
+          </w:p>
+        </w:tc>
+      </w:tr>
+    </w:tbl>
+    <w:p/>
+    <w:p>
+      <w:r>
+        <w:t>Por eso la herramienta de cromosomas no responde una curiosidad: responde</w:t>
+      </w:r>
+    </w:p>
+    <w:p>
+      <w:r>
+        <w:rPr>
+          <w:b/>
+        </w:rPr>
+        <w:t>«¿qué trabajo tengo pendiente?»</w:t>
+      </w:r>
+      <w:r>
+        <w:t>. Y por eso importó descubrir que la lista</w:t>
+      </w:r>
+    </w:p>
+    <w:p>
+      <w:r>
+        <w:t>truncaba en silencio —mostraba 50 de 100— sin avisar: un analista podía creer</w:t>
+      </w:r>
+    </w:p>
+    <w:p>
+      <w:r>
+        <w:t>tener su cola vacía faltándole la mitad.</w:t>
+      </w:r>
+    </w:p>
     <w:p/>
     <w:p>
       <w:pPr>

</xml_diff>